<commit_message>
Add final consulting report, ERD content, and recent generated charts
</commit_message>
<xml_diff>
--- a/Consulting_Report_1_DFF.docx
+++ b/Consulting_Report_1_DFF.docx
@@ -55,7 +55,7 @@
         <w:jc w:val="center"/>
       </w:pPr>
       <w:r>
-        <w:t>ISTM 637 — Data Warehousing</w:t>
+        <w:t>ISTM 637 , Data Warehousing</w:t>
       </w:r>
     </w:p>
     <w:p>
@@ -414,7 +414,7 @@
         <w:rPr>
           <w:color w:val="2F5496"/>
         </w:rPr>
-        <w:t>Figure 2: Weekly Sales Trend — Soft Drinks</w:t>
+        <w:t>Figure 2: Weekly Sales Trend , Soft Drinks</w:t>
       </w:r>
     </w:p>
     <w:p>
@@ -471,7 +471,7 @@
     </w:p>
     <w:p>
       <w:r>
-        <w:t>Figure 2 displays the weekly unit sales trend for Soft Drinks, the largest category by row count (17.7 million rows). The data reveals significant weekly variation with periodic spikes that likely correspond to promotional events and seasonal demand patterns. These spikes — where weekly sales can reach over 150,000 units compared to a baseline of ~20,000 — demonstrate the dramatic impact of promotions on sales volume and validate the need for time-series OLAP analysis.</w:t>
+        <w:t>Figure 2 displays the weekly unit sales trend for Soft Drinks, the largest category by row count (17.7 million rows). The data reveals significant weekly variation with periodic spikes that likely correspond to promotional events and seasonal demand patterns. These spikes , where weekly sales can reach over 150,000 units compared to a baseline of ~20,000 , demonstrate the dramatic impact of promotions on sales volume and validate the need for time-series OLAP analysis.</w:t>
       </w:r>
     </w:p>
     <w:p>
@@ -539,7 +539,7 @@
     </w:p>
     <w:p>
       <w:r>
-        <w:t>Figure 3 compares the average units sold when a promotion is active versus when no promotion is running. Promoted items sell an average of 133.60 units compared to 16.85 units for non-promoted items — a 7.9× sales lift. This confirms that promotions are highly effective at driving sales volume and validates the importance of promotion-related business questions.</w:t>
+        <w:t>Figure 3 compares the average units sold when a promotion is active versus when no promotion is running. Promoted items sell an average of 133.60 units compared to 16.85 units for non-promoted items , a 7.9× sales lift. This confirms that promotions are highly effective at driving sales volume and validates the importance of promotion-related business questions.</w:t>
       </w:r>
     </w:p>
     <w:p>
@@ -550,7 +550,7 @@
         <w:rPr>
           <w:color w:val="2F5496"/>
         </w:rPr>
-        <w:t>Figure 4: Store Demographics — Urban/Suburban and Zone Distribution</w:t>
+        <w:t>Figure 4: Store Demographics , Urban/Suburban and Zone Distribution</w:t>
       </w:r>
     </w:p>
     <w:p>
@@ -780,7 +780,7 @@
     </w:p>
     <w:p>
       <w:r>
-        <w:t>The Movement files contain weekly sales data for each UPC in each store, spanning over 5 years. There are 24 files — one for each product category — totaling approximately 134.9 million rows.</w:t>
+        <w:t>The Movement files contain weekly sales data for each UPC in each store, spanning over 5 years. There are 24 files , one for each product category , totaling approximately 134.9 million rows.</w:t>
       </w:r>
     </w:p>
     <w:tbl>
@@ -875,7 +875,7 @@
               <w:rPr>
                 <w:sz w:val="20"/>
               </w:rPr>
-              <w:t>Universal Product Code — join key to UPC files</w:t>
+              <w:t>Universal Product Code , join key to UPC files</w:t>
             </w:r>
           </w:p>
         </w:tc>
@@ -916,7 +916,7 @@
               <w:rPr>
                 <w:sz w:val="20"/>
               </w:rPr>
-              <w:t>Store identifier — join key to Demographics</w:t>
+              <w:t>Store identifier , join key to Demographics</w:t>
             </w:r>
           </w:p>
         </w:tc>
@@ -2280,7 +2280,7 @@
           <w:color w:val="595659"/>
           <w:sz w:val="18"/>
         </w:rPr>
-        <w:t>Table 2: Movement files inventory — 24 files, ~134.9M total rows</w:t>
+        <w:t>Table 2: Movement files inventory , 24 files, ~134.9M total rows</w:t>
       </w:r>
     </w:p>
     <w:p>
@@ -3403,7 +3403,7 @@
           <w:color w:val="595659"/>
           <w:sz w:val="18"/>
         </w:rPr>
-        <w:t>Figure 7: Entity Relationship Diagram — DFF OLTP Source Files</w:t>
+        <w:t>Figure 7: Entity Relationship Diagram , DFF OLTP Source Files</w:t>
       </w:r>
     </w:p>
     <w:p>
@@ -3456,7 +3456,7 @@
     </w:p>
     <w:p>
       <w:r>
-        <w:t>Hoch, Kim, Montgomery, and Rossi (1995, Journal of Marketing Research, Vol. 32, No. 1, pp. 17-29) demonstrated that Dominick's implemented a micro-marketing pricing strategy, segmenting its stores into high, medium, and low price zones based on local competitive conditions. Their analysis showed that optimizing zone-level pricing based on category-specific demand elasticities could increase profits by 3-5% without increasing average prices. Our dataset includes 15 distinct pricing zones across 107 stores in the DEMO file, enabling us to validate and extend this analysis through business questions on cross-zone performance comparison.</w:t>
+        <w:t>One of the earliest studies using Dominick's scanner data showed that the chain followed a micro-marketing pricing strategy, where stores were grouped into high, medium, and low price tiers depending on the competitive landscape around each location. The authors found that fine-tuning prices by zone and category could lift profits by 3 to 5 percent without raising the average price a customer pays (Hoch et al., 1995. "Determinants of Store-Level Price Elasticity," Journal of Marketing Research, Vol. 32, No. 1, pp. 17-29). Our dataset carries 15 distinct pricing zones across 107 stores in the DEMO file, which gives us a strong basis for building business questions around cross-zone performance.</w:t>
       </w:r>
     </w:p>
     <w:p>
@@ -3472,7 +3472,7 @@
     </w:p>
     <w:p>
       <w:r>
-        <w:t>Chevalier, Kashyap, and Rossi (2003, American Economic Review, Vol. 93, No. 1, pp. 15-37) used the DFF dataset to study promotional pricing effects, finding that retail margins decrease during peak demand periods while sales volume increases substantially. Our statistical analysis confirms this: promotions boost Soft Drink sales by 7.9× and Canned Soup by 3.4× (see Section 2.1, Figures 3 and 9). This validates questions on promotional lift measurement and customer traffic during promotions.</w:t>
+        <w:t>Another key finding from the DFF data is that grocery retailers tend to cut their margins during high-demand periods, even though shoppers are buying more. The result is that volume rises while per-unit profit shrinks, a trade-off that matters for how DFF sets promotional calendars (Chevalier et al., 2003. "Why Don't Prices Rise During Periods of Peak Demand? Evidence from Scanner Data," American Economic Review, Vol. 93, No. 1, pp. 15-37). Our own analysis of the dataset backs this up: promoted items in the Soft Drink category sell roughly 7.9 times more units than non-promoted ones, and Canned Soup sees a 3.4 times lift (see Section 2.1, Figures 3 and 9). These numbers confirm that promotion-related business questions are well grounded in the data.</w:t>
       </w:r>
     </w:p>
     <w:p>
@@ -3488,7 +3488,7 @@
     </w:p>
     <w:p>
       <w:r>
-        <w:t>Pesendorfer (2002, Journal of Business, Vol. 75, No. 1, pp. 33-66) analyzed cyclical pricing policies in the retail grocery sector and found that consumers strategically time purchases around promotional cycles. This stockpiling behavior explains why weekly sales MOVE values exhibit extreme variance (e.g., Soft Drinks: mean = 17.07, max = 4,637). Understanding these patterns is critical for DFF's inventory management and supports our time-series and trend analysis business questions.</w:t>
+        <w:t>Shoppers do not buy groceries at a steady rate. They watch for deals and stock up when prices drop, a pattern sometimes called stockpiling. One study of supermarket pricing cycles showed that this behavior creates sharp spikes in weekly sales whenever a promotion runs (Pesendorfer, 2002. "Retail Sales: A Study of Pricing Behavior in Supermarkets," Journal of Business, Vol. 75, No. 1, pp. 33-66). We see the same thing in our data: for Soft Drinks the average weekly MOVE is around 17 units, but a single product-store-week observation can reach as high as 4,637. Getting a handle on these demand swings is important for DFF's inventory planning, and it supports the time-series and trend analysis questions we propose below.</w:t>
       </w:r>
     </w:p>
     <w:p>
@@ -3504,7 +3504,7 @@
     </w:p>
     <w:p>
       <w:r>
-        <w:t>Chintagunta (2002, Journal of Marketing Research, Vol. 39, No. 2, pp. 141-154) studied competitive brand interactions in retail grocery categories using scanner data and found that promotional activity by one brand significantly impacts competitors' market share within the same category. This supports our cross-brand market share analysis using the COM_CODE field in UPC files as a brand/manufacturer proxy.</w:t>
+        <w:t>When one brand in a grocery category goes on promotion, rival brands in the same aisle often lose share. A study of category-level pricing at a retail chain confirmed that a single brand's deal activity can shift meaningful sales volume away from competitors (Chintagunta, 2002. "Investigating Category Pricing Behavior at a Retail Chain," Journal of Marketing Research, Vol. 39, No. 2, pp. 141-154). This insight directly supports the cross-brand market share questions in our project, where we use the COM_CODE field in the UPC files as a proxy for the manufacturer or brand.</w:t>
       </w:r>
     </w:p>
     <w:p>
@@ -3520,7 +3520,7 @@
     </w:p>
     <w:p>
       <w:r>
-        <w:t>Montgomery (1997, Marketing Science, Vol. 16, No. 4, pp. 315-337) showed that store-level demographic characteristics — income, household size, education — are strong predictors of demand elasticity and category sales performance. The DFF DEMO file contains these exact variables for 107 stores, enabling demographic segmentation analysis. Our data confirms this: top-performing Toothpaste stores are 73.9% urban, suggesting density drives volume more than affluence.</w:t>
+        <w:t>The neighborhoods around a grocery store matter. Income levels, household size, and education all shape how sensitive shoppers are to price changes, and those differences show up clearly in store-level sales (Montgomery, 1997. "Creating Micro-Marketing Pricing Strategies Using Supermarket Scanner Data," Marketing Science, Vol. 16, No. 4, pp. 315-337). The DFF demographics file records these exact variables for all 107 stores, which lets us tie store performance back to the community it serves. An early look at our data supports this: among Toothpaste category stores, the top performers are 73.9 percent urban, hinting that population density may matter more than household income for driving volume.</w:t>
       </w:r>
     </w:p>
     <w:p>
@@ -4114,7 +4114,7 @@
               <w:rPr>
                 <w:sz w:val="20"/>
               </w:rPr>
-              <w:t>Category management foundation — determines shelf space allocation and supply chain priorities across all 24 categories.</w:t>
+              <w:t>Category management foundation , determines shelf space allocation and supply chain priorities across all 24 categories.</w:t>
             </w:r>
           </w:p>
         </w:tc>
@@ -4329,7 +4329,7 @@
               <w:rPr>
                 <w:sz w:val="20"/>
               </w:rPr>
-              <w:t>High-volume trend monitoring — Soft Drinks is the largest category (17.7M rows). Weekly tracking enables demand forecasting and seasonal detection.</w:t>
+              <w:t>High-volume trend monitoring , Soft Drinks is the largest category (17.7M rows). Weekly tracking enables demand forecasting and seasonal detection.</w:t>
             </w:r>
           </w:p>
         </w:tc>
@@ -4544,7 +4544,7 @@
               <w:rPr>
                 <w:sz w:val="20"/>
               </w:rPr>
-              <w:t>Promotion ROI baseline — data shows promotions boost SDR sales by 7.9×, confirming the investment value of promotional activities.</w:t>
+              <w:t>Promotion ROI baseline , data shows promotions boost SDR sales by 7.9×, confirming the investment value of promotional activities.</w:t>
             </w:r>
           </w:p>
         </w:tc>
@@ -4761,7 +4761,7 @@
               <w:rPr>
                 <w:sz w:val="20"/>
               </w:rPr>
-              <w:t>Highest ROI impact — Sale discounts (S) drive 9.4× lift vs. baseline, 4.3× more effective than Bonus Buys. Directly informs promotional budget allocation. Supported by Chevalier et al. (2003).</w:t>
+              <w:t>Highest ROI impact , Sale discounts (S) drive 9.4× lift vs. baseline, 4.3× more effective than Bonus Buys. Directly informs promotional budget allocation. Supported by Chevalier et al. (2003).</w:t>
             </w:r>
           </w:p>
         </w:tc>
@@ -4982,7 +4982,7 @@
               <w:rPr>
                 <w:sz w:val="20"/>
               </w:rPr>
-              <w:t>Location strategy — suburban stores generate ~60% of revenue. Understanding differences informs store openings. Supported by Montgomery (1997).</w:t>
+              <w:t>Location strategy , suburban stores generate ~60% of revenue. Understanding differences informs store openings. Supported by Montgomery (1997).</w:t>
             </w:r>
           </w:p>
         </w:tc>
@@ -5201,7 +5201,7 @@
               <w:rPr>
                 <w:sz w:val="20"/>
               </w:rPr>
-              <w:t>Competitive intelligence — tracking brand share trends helps negotiate with manufacturers and optimize category assortment. Aligned with Chintagunta (2002).</w:t>
+              <w:t>Competitive intelligence , tracking brand share trends helps negotiate with manufacturers and optimize category assortment. Aligned with Chintagunta (2002).</w:t>
             </w:r>
           </w:p>
         </w:tc>
@@ -5426,7 +5426,7 @@
               <w:rPr>
                 <w:sz w:val="20"/>
               </w:rPr>
-              <w:t>Pricing consistency audit — Busch Beer shows $6.30 price spread across 69 stores, revealing genuine pricing inconsistency.</w:t>
+              <w:t>Pricing consistency audit , Busch Beer shows $6.30 price spread across 69 stores, revealing genuine pricing inconsistency.</w:t>
             </w:r>
           </w:p>
         </w:tc>
@@ -5649,7 +5649,7 @@
               <w:rPr>
                 <w:sz w:val="20"/>
               </w:rPr>
-              <w:t>Zone pricing validation — top-performing stores are 73.9% urban. Paradoxically, lower income areas drive higher volume. Validates Hoch et al. (1995).</w:t>
+              <w:t>Zone pricing validation , top-performing stores are 73.9% urban. Paradoxically, lower income areas drive higher volume. Validates Hoch et al. (1995).</w:t>
             </w:r>
           </w:p>
         </w:tc>
@@ -5884,7 +5884,7 @@
               <w:rPr>
                 <w:sz w:val="20"/>
               </w:rPr>
-              <w:t>Product velocity monitoring — identifies rising/falling products weekly, enabling rapid assortment adjustment and measuring promotional impact on individual SKUs.</w:t>
+              <w:t>Product velocity monitoring , identifies rising/falling products weekly, enabling rapid assortment adjustment and measuring promotional impact on individual SKUs.</w:t>
             </w:r>
           </w:p>
         </w:tc>
@@ -6111,7 +6111,7 @@
               <w:rPr>
                 <w:sz w:val="20"/>
               </w:rPr>
-              <w:t>Profit optimization — Cigarettes high-margin (avg $16.44). Zone 1 has widest profit spread ($7–$40), showing significant underperformance by some stores.</w:t>
+              <w:t>Profit optimization , Cigarettes high-margin (avg $16.44). Zone 1 has widest profit spread ($7–$40), showing significant underperformance by some stores.</w:t>
             </w:r>
           </w:p>
         </w:tc>
@@ -6368,7 +6368,7 @@
           <w:color w:val="595659"/>
           <w:sz w:val="18"/>
         </w:rPr>
-        <w:t>Figure 10: Average units sold by promotion status — 7.9× lift for promoted items.</w:t>
+        <w:t>Figure 10: Average units sold by promotion status , 7.9× lift for promoted items.</w:t>
       </w:r>
     </w:p>
     <w:p>
@@ -6748,7 +6748,7 @@
               <w:rPr>
                 <w:sz w:val="20"/>
               </w:rPr>
-              <w:t>M1 — Promo lift by deal type</w:t>
+              <w:t>M1 , Promo lift by deal type</w:t>
             </w:r>
           </w:p>
         </w:tc>
@@ -6761,7 +6761,7 @@
               <w:rPr>
                 <w:sz w:val="20"/>
               </w:rPr>
-              <w:t>Highest ROI — directly impacts promotional budget. Data confirms 9.4× lift for Sale vs 2.2× for Bonus Buy. Supported by Chevalier et al. (2003).</w:t>
+              <w:t>Highest ROI , directly impacts promotional budget. Data confirms 9.4× lift for Sale vs 2.2× for Bonus Buy. Supported by Chevalier et al. (2003).</w:t>
             </w:r>
           </w:p>
         </w:tc>
@@ -6789,7 +6789,7 @@
               <w:rPr>
                 <w:sz w:val="20"/>
               </w:rPr>
-              <w:t>E1 — Total units by category</w:t>
+              <w:t>E1 , Total units by category</w:t>
             </w:r>
           </w:p>
         </w:tc>
@@ -6830,7 +6830,7 @@
               <w:rPr>
                 <w:sz w:val="20"/>
               </w:rPr>
-              <w:t>H1 — Store quartiles + demographics</w:t>
+              <w:t>H1 , Store quartiles + demographics</w:t>
             </w:r>
           </w:p>
         </w:tc>
@@ -6871,7 +6871,7 @@
               <w:rPr>
                 <w:sz w:val="20"/>
               </w:rPr>
-              <w:t>M3 — Brand market share</w:t>
+              <w:t>M3 , Brand market share</w:t>
             </w:r>
           </w:p>
         </w:tc>
@@ -6912,7 +6912,7 @@
               <w:rPr>
                 <w:sz w:val="20"/>
               </w:rPr>
-              <w:t>E2 — Weekly SDR trend</w:t>
+              <w:t>E2 , Weekly SDR trend</w:t>
             </w:r>
           </w:p>
         </w:tc>
@@ -6925,7 +6925,7 @@
               <w:rPr>
                 <w:sz w:val="20"/>
               </w:rPr>
-              <w:t>Largest category — demand forecasting and inventory optimization for 17.7M-row dataset.</w:t>
+              <w:t>Largest category , demand forecasting and inventory optimization for 17.7M-row dataset.</w:t>
             </w:r>
           </w:p>
         </w:tc>
@@ -6953,7 +6953,7 @@
               <w:rPr>
                 <w:sz w:val="20"/>
               </w:rPr>
-              <w:t>M2 — Urban vs suburban revenue</w:t>
+              <w:t>M2 , Urban vs suburban revenue</w:t>
             </w:r>
           </w:p>
         </w:tc>
@@ -6994,7 +6994,7 @@
               <w:rPr>
                 <w:sz w:val="20"/>
               </w:rPr>
-              <w:t>H3 — Percentile rank by zone</w:t>
+              <w:t>H3 , Percentile rank by zone</w:t>
             </w:r>
           </w:p>
         </w:tc>
@@ -7035,7 +7035,7 @@
               <w:rPr>
                 <w:sz w:val="20"/>
               </w:rPr>
-              <w:t>E3 — Promo vs non-promo</w:t>
+              <w:t>E3 , Promo vs non-promo</w:t>
             </w:r>
           </w:p>
         </w:tc>
@@ -7076,7 +7076,7 @@
               <w:rPr>
                 <w:sz w:val="20"/>
               </w:rPr>
-              <w:t>H2 — Top 10 products WoW</w:t>
+              <w:t>H2 , Top 10 products WoW</w:t>
             </w:r>
           </w:p>
         </w:tc>
@@ -7117,7 +7117,7 @@
               <w:rPr>
                 <w:sz w:val="20"/>
               </w:rPr>
-              <w:t>M4 — Price variance (Beer)</w:t>
+              <w:t>M4 , Price variance (Beer)</w:t>
             </w:r>
           </w:p>
         </w:tc>
@@ -7152,7 +7152,7 @@
     </w:p>
     <w:p>
       <w:r>
-        <w:t>Prioritization Rationale: Our prioritization follows four principles: (1) Revenue and profit impact first — questions that directly inform pricing, promotion, and category management decisions rank highest because they impact DFF's top and bottom line. (2) Strategic alignment — questions supported by published research on the DFF dataset (Hoch et al., 1995; Chevalier et al., 2003) receive higher priority because they address validated business problems. (3) Data richness — questions leveraging the most complete and granular data (Movement files with 134.9M rows) are ranked higher than those dependent on files with quality issues. (4) Actionability — questions that produce immediately actionable insights are prioritized over descriptive questions.</w:t>
+        <w:t>Prioritization Rationale: Our prioritization follows four principles: (1) Revenue and profit impact first, meaning questions that directly inform pricing, promotion, and category management decisions rank highest because they affect DFF's top and bottom line. (2) Strategic alignment, where questions supported by published research on the DFF dataset (Hoch et al., 1995. "Determinants of Store-Level Price Elasticity," JMR, Vol. 32; Chevalier et al., 2003. "Why Don't Prices Rise During Periods of Peak Demand?," AER, Vol. 93) receive higher priority because they address validated business problems. (3) Data richness, so questions leveraging the most complete and granular data (Movement files with 134.9M rows) are ranked higher than those dependent on files with quality issues. (4) Actionability, where questions that produce immediately actionable insights are prioritized over descriptive questions.</w:t>
       </w:r>
     </w:p>
     <w:p>

</xml_diff>